<commit_message>
Complete dev-to-usr migration invariant
</commit_message>
<xml_diff>
--- a/doc/ZX-UX C48 SDK User Manual.docx
+++ b/doc/ZX-UX C48 SDK User Manual.docx
@@ -234,7 +234,7 @@
         <w:t xml:space="preserve">Host-development boundary. </w:t>
       </w:r>
       <w:r>
-        <w:t>The SDK compiles to the deterministic C48B1 host executable format and executes it in the C48 virtual machine. C48B1 is not Z80 machine code, ZX-UX OBJ1, or ZX-UX MEX1. The host API in dev/src/c48host.h is also a development profile, not a claim that the final native ZX-UX ABI is frozen.</w:t>
+        <w:t>The SDK compiles to the deterministic C48B1 host executable format and executes it in the C48 virtual machine. C48B1 is not Z80 machine code, ZX-UX OBJ1, or ZX-UX MEX1. The host API in usr/src/c48host.h is also a development profile, not a claim that the final native ZX-UX ABI is frozen.</w:t>
       </w:r>
     </w:p>
     <w:p>
@@ -417,7 +417,7 @@
     </w:p>
     <w:p>
       <w:r>
-        <w:t>The SDK workflow is compile, then run. Sources under dev/src/ compile by default into the matching path under dev/bin/. Sources elsewhere compile beside the source with a .c48b suffix unless an output path is supplied.</w:t>
+        <w:t>The SDK workflow is compile, then run. Sources under usr/src/ compile by default into the matching path under usr/bin/. Sources elsewhere compile beside the source with a .c48b suffix unless an output path is supplied.</w:t>
       </w:r>
     </w:p>
     <w:tbl>
@@ -524,7 +524,7 @@
                 <w:rFonts w:ascii="Consolas" w:hAnsi="Consolas" w:eastAsia="Consolas"/>
                 <w:sz w:val="15"/>
               </w:rPr>
-              <w:t>c48 dev/src/demos/forest.c</w:t>
+              <w:t>c48 usr/src/demos/forest.c</w:t>
             </w:r>
           </w:p>
         </w:tc>
@@ -593,7 +593,7 @@
                 <w:rFonts w:ascii="Consolas" w:hAnsi="Consolas" w:eastAsia="Consolas"/>
                 <w:sz w:val="15"/>
               </w:rPr>
-              <w:t>c48run dev/bin/demos/forest.c48b</w:t>
+              <w:t>c48run usr/bin/demos/forest.c48b</w:t>
             </w:r>
           </w:p>
         </w:tc>
@@ -662,7 +662,7 @@
                 <w:rFonts w:ascii="Consolas" w:hAnsi="Consolas" w:eastAsia="Consolas"/>
                 <w:sz w:val="15"/>
               </w:rPr>
-              <w:t>c48run --headless dev/bin/demos/forest.c48b</w:t>
+              <w:t>c48run --headless usr/bin/demos/forest.c48b</w:t>
             </w:r>
           </w:p>
         </w:tc>
@@ -731,7 +731,7 @@
                 <w:rFonts w:ascii="Consolas" w:hAnsi="Consolas" w:eastAsia="Consolas"/>
                 <w:sz w:val="15"/>
               </w:rPr>
-              <w:t>c48run --headless --dump-screen forest.scr dev/bin/demos/forest.c48b</w:t>
+              <w:t>c48run --headless --dump-screen forest.scr usr/bin/demos/forest.c48b</w:t>
             </w:r>
           </w:p>
         </w:tc>
@@ -800,7 +800,7 @@
                 <w:rFonts w:ascii="Consolas" w:hAnsi="Consolas" w:eastAsia="Consolas"/>
                 <w:sz w:val="15"/>
               </w:rPr>
-              <w:t>c48run --font PATH dev/bin/demos/forest.c48b</w:t>
+              <w:t>c48run --font PATH usr/bin/demos/forest.c48b</w:t>
             </w:r>
           </w:p>
         </w:tc>
@@ -869,7 +869,7 @@
                 <w:rFonts w:ascii="Consolas" w:hAnsi="Consolas" w:eastAsia="Consolas"/>
                 <w:sz w:val="15"/>
               </w:rPr>
-              <w:t>c48run --heap 2048 dev/bin/demos/forest.c48b</w:t>
+              <w:t>c48run --heap 2048 usr/bin/demos/forest.c48b</w:t>
             </w:r>
           </w:p>
         </w:tc>
@@ -938,7 +938,7 @@
                 <w:rFonts w:ascii="Consolas" w:hAnsi="Consolas" w:eastAsia="Consolas"/>
                 <w:sz w:val="15"/>
               </w:rPr>
-              <w:t>c48run --max-steps 10000 dev/bin/demos/forest.c48b</w:t>
+              <w:t>c48run --max-steps 10000 usr/bin/demos/forest.c48b</w:t>
             </w:r>
           </w:p>
         </w:tc>
@@ -1024,7 +1024,7 @@
             <w:u w:val="single"/>
             <w:rFonts w:ascii="Aptos" w:hAnsi="Aptos"/>
           </w:rPr>
-          <w:t>dev/src/demos/forest.c</w:t>
+          <w:t>usr/src/demos/forest.c</w:t>
         </w:r>
       </w:hyperlink>
       <w:r>
@@ -1071,9 +1071,9 @@
                 <w:color w:val="222222"/>
                 <w:sz w:val="17"/>
               </w:rPr>
-              <w:t>c48.bat dev\src\demos\forest.c</w:t>
+              <w:t>c48.bat usr\src\demos\forest.c</w:t>
               <w:br/>
-              <w:t>c48run.bat dev\bin\demos\forest.c48b</w:t>
+              <w:t>c48run.bat usr\bin\demos\forest.c48b</w:t>
             </w:r>
           </w:p>
         </w:tc>
@@ -1119,9 +1119,9 @@
                 <w:color w:val="222222"/>
                 <w:sz w:val="17"/>
               </w:rPr>
-              <w:t>./c48 dev/src/demos/forest.c</w:t>
+              <w:t>./c48 usr/src/demos/forest.c</w:t>
               <w:br/>
-              <w:t>./c48run dev/bin/demos/forest.c48b</w:t>
+              <w:t>./c48run usr/bin/demos/forest.c48b</w:t>
             </w:r>
           </w:p>
         </w:tc>
@@ -1167,7 +1167,7 @@
                 <w:color w:val="222222"/>
                 <w:sz w:val="17"/>
               </w:rPr>
-              <w:t>./c48run --headless --dump-screen forest.scr dev/bin/demos/forest.c48b</w:t>
+              <w:t>./c48run --headless --dump-screen forest.scr usr/bin/demos/forest.c48b</w:t>
             </w:r>
           </w:p>
         </w:tc>

</xml_diff>

<commit_message>
Implement ROM-compatible C48 BEEP
</commit_message>
<xml_diff>
--- a/doc/ZX-UX C48 SDK User Manual.docx
+++ b/doc/ZX-UX C48 SDK User Manual.docx
@@ -288,7 +288,7 @@
         <w:spacing w:after="40"/>
       </w:pPr>
       <w:r>
-        <w:t>No third-party Python packages are required by the compiler or headless runtime.</w:t>
+        <w:t>No third-party Python packages are required by the compiler or non-audio headless runtime. Audible beep() playback requires the optional playsound3==3.3.2 adapter.</w:t>
       </w:r>
     </w:p>
     <w:p>
@@ -2196,7 +2196,7 @@
               <w:rPr>
                 <w:sz w:val="17"/>
               </w:rPr>
-              <w:t>No third-party Python packages required by compiler or headless runtime</w:t>
+              <w:t>No third-party packages for compiler/non-audio runtime; audible beep() optionally uses playsound3==3.3.2</w:t>
             </w:r>
           </w:p>
         </w:tc>

</xml_diff>

<commit_message>
Freeze C48 SDK 1.0.0-RC1 candidate
</commit_message>
<xml_diff>
--- a/doc/ZX-UX C48 SDK User Manual.docx
+++ b/doc/ZX-UX C48 SDK User Manual.docx
@@ -124,7 +124,7 @@
           <w:color w:val="646464"/>
           <w:sz w:val="18"/>
         </w:rPr>
-        <w:t>SDK 0.9.0-dev  |  September 2026</w:t>
+        <w:t>SDK 1.0.0-RC1  |  September 2026</w:t>
       </w:r>
     </w:p>
     <w:p>
@@ -164,7 +164,7 @@
         <w:t xml:space="preserve">ZX-UX C48 SDK </w:t>
       </w:r>
       <w:r>
-        <w:t>is the portable host-side development kit for writing, compiling, testing, and running C48 programs on modern Windows and Linux systems while the target-native ZX-UX toolchain continues to evolve. The current repository is a pre-1.0 development snapshot.</w:t>
+        <w:t>is the portable host-side development kit for writing, compiling, testing, and running C48 programs on modern Windows, Linux, and macOS systems while the target-native ZX-UX toolchain continues to evolve. This manual describes the 1.0.0-RC1 release candidate; final 1.0 is not declared until the release gates pass.</w:t>
       </w:r>
     </w:p>
     <w:p>
@@ -234,7 +234,7 @@
         <w:t xml:space="preserve">Host-development boundary. </w:t>
       </w:r>
       <w:r>
-        <w:t>The SDK compiles to the deterministic C48B1 host executable format and executes it in the C48 virtual machine. C48B1 is not Z80 machine code, ZX-UX OBJ1, or ZX-UX MEX1. The host API in usr/src/c48host.h is also a development profile, not a claim that the final native ZX-UX ABI is frozen.</w:t>
+        <w:t>The SDK compiles to the deterministic C48B1 host executable format and executes it in the C48 virtual machine. C48B1 is not Z80 machine code, ZX-UX OBJ1, or ZX-UX MEX1. The host API in usr/src/c48host.h is also a development profile, not a claim that the final native ZX-UX ABI is frozen. Windows-specific portability wording in the frozen Compiler User Manual describes the target/native compatibility contract; it is not the host-SDK platform support matrix.</w:t>
       </w:r>
     </w:p>
     <w:p>
@@ -270,7 +270,7 @@
         <w:spacing w:after="40"/>
       </w:pPr>
       <w:r>
-        <w:t>Linux: Python available as python3 on PATH.</w:t>
+        <w:t>Linux/macOS (POSIX): Python available as python3 on PATH.</w:t>
       </w:r>
     </w:p>
     <w:p>
@@ -288,7 +288,7 @@
         <w:spacing w:after="40"/>
       </w:pPr>
       <w:r>
-        <w:t>No third-party Python packages are required by the compiler or non-audio headless runtime. Audible beep() playback requires the optional playsound3==3.3.2 adapter.</w:t>
+        <w:t>No third-party Python packages are required by the compiler or non-audio headless runtime. Audible beep() playback requires the optional playsound3==3.3.2 adapter. Automated release evidence proves ROM-derived waveform and blocking timing numerically/headlessly; it does not certify that a physical speaker emitted sound. The release package is one platform-neutral ZIP containing both Windows batch and POSIX shell launchers; no separate native host installer is required.</w:t>
       </w:r>
     </w:p>
     <w:p>
@@ -386,7 +386,7 @@
               <w:t xml:space="preserve">  c48run.bat --version</w:t>
               <w:br/>
               <w:br/>
-              <w:t>Linux:</w:t>
+              <w:t>Linux / macOS (POSIX):</w:t>
               <w:br/>
               <w:t xml:space="preserve">  ./c48 --version</w:t>
               <w:br/>
@@ -1084,7 +1084,7 @@
         <w:rPr>
           <w:b/>
         </w:rPr>
-        <w:t>Linux:</w:t>
+        <w:t>Linux / macOS (POSIX):</w:t>
       </w:r>
     </w:p>
     <w:tbl>
@@ -1461,7 +1461,7 @@
               <w:rPr>
                 <w:sz w:val="17"/>
               </w:rPr>
-              <w:t>0.9.0-dev (pre-1.0 development snapshot)</w:t>
+              <w:t>1.0.0-RC1 (release candidate; final 1.0 not yet declared)</w:t>
             </w:r>
           </w:p>
         </w:tc>
@@ -1510,7 +1510,7 @@
               <w:rPr>
                 <w:sz w:val="17"/>
               </w:rPr>
-              <w:t>Windows and Linux command-line workflow; Tk graphical visualizer for interactive use</w:t>
+              <w:t>Windows, Linux and macOS command-line workflow; Tk graphical visualizer for interactive use</w:t>
             </w:r>
           </w:p>
         </w:tc>
@@ -2098,7 +2098,7 @@
               <w:rPr>
                 <w:sz w:val="17"/>
               </w:rPr>
-              <w:t>Cross-platform release verifier, deterministic rebuilds, manifest validation, security fixtures</w:t>
+              <w:t>Full verifier on Ubuntu x64, Windows x64, macOS arm64 and macOS Intel under Python 3.10/3.13; deterministic rebuilds, manifest validation, security fixtures</w:t>
             </w:r>
           </w:p>
         </w:tc>
@@ -2344,7 +2344,7 @@
               <w:color w:val="6E6E6E"/>
               <w:sz w:val="16"/>
             </w:rPr>
-            <w:t>ZX-UX C48 SDK User Manual  |  SDK 0.9.0-dev</w:t>
+            <w:t>ZX-UX C48 SDK User Manual  |  SDK 1.0.0-RC1</w:t>
           </w:r>
         </w:p>
       </w:tc>

</xml_diff>

<commit_message>
Freeze C48 SDK 1.0.0 final candidate
</commit_message>
<xml_diff>
--- a/doc/ZX-UX C48 SDK User Manual.docx
+++ b/doc/ZX-UX C48 SDK User Manual.docx
@@ -124,7 +124,7 @@
           <w:color w:val="646464"/>
           <w:sz w:val="18"/>
         </w:rPr>
-        <w:t>SDK 1.0.0-RC1  |  September 2026</w:t>
+        <w:t>SDK 1.0.0  |  September 2026</w:t>
       </w:r>
     </w:p>
     <w:p>
@@ -164,7 +164,7 @@
         <w:t xml:space="preserve">ZX-UX C48 SDK </w:t>
       </w:r>
       <w:r>
-        <w:t>is the portable host-side development kit for writing, compiling, testing, and running C48 programs on modern Windows, Linux, and macOS systems while the target-native ZX-UX toolchain continues to evolve. This manual describes the 1.0.0-RC1 release candidate; final 1.0 is not declared until the release gates pass.</w:t>
+        <w:t>is the portable host-side development kit for writing, compiling, testing, and running C48 programs on modern Windows, Linux, and macOS systems while the target-native ZX-UX toolchain continues to evolve. This manual describes the 1.0.0 final-release candidate; the formal 1.0.0 GitHub release is not published until the release gates pass.</w:t>
       </w:r>
     </w:p>
     <w:p>
@@ -1461,7 +1461,7 @@
               <w:rPr>
                 <w:sz w:val="17"/>
               </w:rPr>
-              <w:t>1.0.0-RC1 (release candidate; final 1.0 not yet declared)</w:t>
+              <w:t>1.0.0 (final candidate; formal release pending desktop certification)</w:t>
             </w:r>
           </w:p>
         </w:tc>
@@ -2344,7 +2344,7 @@
               <w:color w:val="6E6E6E"/>
               <w:sz w:val="16"/>
             </w:rPr>
-            <w:t>ZX-UX C48 SDK User Manual  |  SDK 1.0.0-RC1</w:t>
+            <w:t>ZX-UX C48 SDK User Manual  |  SDK 1.0.0</w:t>
           </w:r>
         </w:p>
       </w:tc>

</xml_diff>